<commit_message>
added topic in spring core topics
</commit_message>
<xml_diff>
--- a/TheorynCoding/Study Material/Java Overall/Java Overall/Advance Java/Spring Core Topics.docx
+++ b/TheorynCoding/Study Material/Java Overall/Java Overall/Advance Java/Spring Core Topics.docx
@@ -47,6 +47,7 @@
           <w:bCs/>
           <w:sz w:val="27"/>
           <w:szCs w:val="27"/>
+          <w:highlight w:val="yellow"/>
           <w:lang w:eastAsia="en-IN"/>
         </w:rPr>
         <w:t>1. Introduction to Spring Framework</w:t>
@@ -75,8 +76,6 @@
         </w:rPr>
         <w:t xml:space="preserve">What is Spring </w:t>
       </w:r>
-      <w:bookmarkStart w:id="0" w:name="_GoBack"/>
-      <w:bookmarkEnd w:id="0"/>
     </w:p>
     <w:p>
       <w:pPr>
@@ -216,6 +215,7 @@
           <w:bCs/>
           <w:sz w:val="27"/>
           <w:szCs w:val="27"/>
+          <w:highlight w:val="yellow"/>
           <w:lang w:eastAsia="en-IN"/>
         </w:rPr>
         <w:t>2. IOC (Inversion of Control)</w:t>
@@ -348,6 +348,8 @@
           <w:lang w:eastAsia="en-IN"/>
         </w:rPr>
       </w:pPr>
+      <w:bookmarkStart w:id="0" w:name="_GoBack"/>
+      <w:bookmarkEnd w:id="0"/>
       <w:r>
         <w:rPr>
           <w:rFonts w:ascii="Times New Roman" w:eastAsia="Times New Roman" w:hAnsi="Times New Roman" w:cs="Times New Roman"/>
@@ -355,6 +357,7 @@
           <w:bCs/>
           <w:sz w:val="27"/>
           <w:szCs w:val="27"/>
+          <w:highlight w:val="yellow"/>
           <w:lang w:eastAsia="en-IN"/>
         </w:rPr>
         <w:t>3. Dependency Injection (DI)</w:t>

</xml_diff>

<commit_message>
add new topics in spring core topics
</commit_message>
<xml_diff>
--- a/TheorynCoding/Study Material/Java Overall/Java Overall/Advance Java/Spring Core Topics.docx
+++ b/TheorynCoding/Study Material/Java Overall/Java Overall/Advance Java/Spring Core Topics.docx
@@ -348,8 +348,6 @@
           <w:lang w:eastAsia="en-IN"/>
         </w:rPr>
       </w:pPr>
-      <w:bookmarkStart w:id="0" w:name="_GoBack"/>
-      <w:bookmarkEnd w:id="0"/>
       <w:r>
         <w:rPr>
           <w:rFonts w:ascii="Times New Roman" w:eastAsia="Times New Roman" w:hAnsi="Times New Roman" w:cs="Times New Roman"/>
@@ -845,6 +843,56 @@
     </w:p>
     <w:p>
       <w:pPr>
+        <w:numPr>
+          <w:ilvl w:val="0"/>
+          <w:numId w:val="4"/>
+        </w:numPr>
+        <w:spacing w:before="100" w:beforeAutospacing="1" w:after="100" w:afterAutospacing="1" w:line="240" w:lineRule="auto"/>
+        <w:rPr>
+          <w:rFonts w:ascii="Times New Roman" w:eastAsia="Times New Roman" w:hAnsi="Times New Roman" w:cs="Times New Roman"/>
+          <w:lang w:eastAsia="en-IN"/>
+        </w:rPr>
+      </w:pPr>
+      <w:r>
+        <w:rPr>
+          <w:rFonts w:ascii="Times New Roman" w:eastAsia="Times New Roman" w:hAnsi="Times New Roman" w:cs="Times New Roman"/>
+          <w:lang w:eastAsia="en-IN"/>
+        </w:rPr>
+        <w:t xml:space="preserve">How are bean created in spring, spring </w:t>
+      </w:r>
+      <w:proofErr w:type="spellStart"/>
+      <w:r>
+        <w:rPr>
+          <w:rFonts w:ascii="Times New Roman" w:eastAsia="Times New Roman" w:hAnsi="Times New Roman" w:cs="Times New Roman"/>
+          <w:lang w:eastAsia="en-IN"/>
+        </w:rPr>
+        <w:t>mvc</w:t>
+      </w:r>
+      <w:proofErr w:type="spellEnd"/>
+      <w:r>
+        <w:rPr>
+          <w:rFonts w:ascii="Times New Roman" w:eastAsia="Times New Roman" w:hAnsi="Times New Roman" w:cs="Times New Roman"/>
+          <w:lang w:eastAsia="en-IN"/>
+        </w:rPr>
+        <w:t>, spring boot</w:t>
+      </w:r>
+    </w:p>
+    <w:p>
+      <w:pPr>
+        <w:spacing w:before="100" w:beforeAutospacing="1" w:after="100" w:afterAutospacing="1" w:line="240" w:lineRule="auto"/>
+        <w:ind w:left="1440"/>
+        <w:rPr>
+          <w:rFonts w:ascii="Times New Roman" w:eastAsia="Times New Roman" w:hAnsi="Times New Roman" w:cs="Times New Roman"/>
+          <w:sz w:val="24"/>
+          <w:szCs w:val="24"/>
+          <w:lang w:eastAsia="en-IN"/>
+        </w:rPr>
+      </w:pPr>
+      <w:bookmarkStart w:id="0" w:name="_GoBack"/>
+      <w:bookmarkEnd w:id="0"/>
+    </w:p>
+    <w:p>
+      <w:pPr>
         <w:spacing w:after="0" w:line="240" w:lineRule="auto"/>
         <w:rPr>
           <w:rFonts w:ascii="Times New Roman" w:eastAsia="Times New Roman" w:hAnsi="Times New Roman" w:cs="Times New Roman"/>
@@ -860,6 +908,7 @@
           <w:szCs w:val="24"/>
           <w:lang w:eastAsia="en-IN"/>
         </w:rPr>
+        <w:lastRenderedPageBreak/>
         <w:pict>
           <v:rect id="_x0000_i1028" style="width:0;height:1.5pt" o:hralign="center" o:hrstd="t" o:hr="t" fillcolor="#a0a0a0" stroked="f"/>
         </w:pict>
@@ -887,7 +936,6 @@
           <w:szCs w:val="27"/>
           <w:lang w:eastAsia="en-IN"/>
         </w:rPr>
-        <w:lastRenderedPageBreak/>
         <w:t>5. Spring Container</w:t>
       </w:r>
     </w:p>
@@ -1344,6 +1392,7 @@
           <w:szCs w:val="20"/>
           <w:lang w:eastAsia="en-IN"/>
         </w:rPr>
+        <w:lastRenderedPageBreak/>
         <w:t>@</w:t>
       </w:r>
       <w:proofErr w:type="spellStart"/>
@@ -1421,7 +1470,6 @@
           <w:szCs w:val="20"/>
           <w:lang w:eastAsia="en-IN"/>
         </w:rPr>
-        <w:lastRenderedPageBreak/>
         <w:t>@Primary</w:t>
       </w:r>
       <w:r>
@@ -1642,6 +1690,111 @@
         </w:rPr>
         <w:t xml:space="preserve"> </w:t>
       </w:r>
+    </w:p>
+    <w:p>
+      <w:pPr>
+        <w:numPr>
+          <w:ilvl w:val="0"/>
+          <w:numId w:val="7"/>
+        </w:numPr>
+        <w:spacing w:before="100" w:beforeAutospacing="1" w:after="100" w:afterAutospacing="1" w:line="240" w:lineRule="auto"/>
+        <w:rPr>
+          <w:rFonts w:ascii="Courier New" w:eastAsia="Times New Roman" w:hAnsi="Courier New" w:cs="Courier New"/>
+          <w:sz w:val="20"/>
+          <w:szCs w:val="20"/>
+          <w:lang w:eastAsia="en-IN"/>
+        </w:rPr>
+      </w:pPr>
+      <w:r>
+        <w:rPr>
+          <w:rFonts w:ascii="Courier New" w:eastAsia="Times New Roman" w:hAnsi="Courier New" w:cs="Courier New"/>
+          <w:sz w:val="20"/>
+          <w:szCs w:val="20"/>
+          <w:lang w:eastAsia="en-IN"/>
+        </w:rPr>
+        <w:t>@</w:t>
+      </w:r>
+      <w:proofErr w:type="spellStart"/>
+      <w:r>
+        <w:rPr>
+          <w:rFonts w:ascii="Courier New" w:eastAsia="Times New Roman" w:hAnsi="Courier New" w:cs="Courier New"/>
+          <w:sz w:val="20"/>
+          <w:szCs w:val="20"/>
+          <w:lang w:eastAsia="en-IN"/>
+        </w:rPr>
+        <w:t>SpringBootConfiguration</w:t>
+      </w:r>
+      <w:proofErr w:type="spellEnd"/>
+    </w:p>
+    <w:p>
+      <w:pPr>
+        <w:numPr>
+          <w:ilvl w:val="0"/>
+          <w:numId w:val="7"/>
+        </w:numPr>
+        <w:spacing w:before="100" w:beforeAutospacing="1" w:after="100" w:afterAutospacing="1" w:line="240" w:lineRule="auto"/>
+        <w:rPr>
+          <w:rFonts w:ascii="Courier New" w:eastAsia="Times New Roman" w:hAnsi="Courier New" w:cs="Courier New"/>
+          <w:sz w:val="20"/>
+          <w:szCs w:val="20"/>
+          <w:lang w:eastAsia="en-IN"/>
+        </w:rPr>
+      </w:pPr>
+      <w:r>
+        <w:rPr>
+          <w:rFonts w:ascii="Courier New" w:eastAsia="Times New Roman" w:hAnsi="Courier New" w:cs="Courier New"/>
+          <w:sz w:val="20"/>
+          <w:szCs w:val="20"/>
+          <w:lang w:eastAsia="en-IN"/>
+        </w:rPr>
+        <w:t>@</w:t>
+      </w:r>
+      <w:proofErr w:type="spellStart"/>
+      <w:r>
+        <w:rPr>
+          <w:rFonts w:ascii="Courier New" w:eastAsia="Times New Roman" w:hAnsi="Courier New" w:cs="Courier New"/>
+          <w:sz w:val="20"/>
+          <w:szCs w:val="20"/>
+          <w:lang w:eastAsia="en-IN"/>
+        </w:rPr>
+        <w:t>EnableAutoConfiguration</w:t>
+      </w:r>
+      <w:proofErr w:type="spellEnd"/>
+    </w:p>
+    <w:p>
+      <w:pPr>
+        <w:numPr>
+          <w:ilvl w:val="0"/>
+          <w:numId w:val="7"/>
+        </w:numPr>
+        <w:spacing w:before="100" w:beforeAutospacing="1" w:after="100" w:afterAutospacing="1" w:line="240" w:lineRule="auto"/>
+        <w:rPr>
+          <w:rFonts w:ascii="Courier New" w:eastAsia="Times New Roman" w:hAnsi="Courier New" w:cs="Courier New"/>
+          <w:sz w:val="20"/>
+          <w:szCs w:val="20"/>
+          <w:lang w:eastAsia="en-IN"/>
+        </w:rPr>
+      </w:pPr>
+      <w:r>
+        <w:rPr>
+          <w:rFonts w:ascii="Courier New" w:eastAsia="Times New Roman" w:hAnsi="Courier New" w:cs="Courier New"/>
+          <w:sz w:val="20"/>
+          <w:szCs w:val="20"/>
+          <w:lang w:eastAsia="en-IN"/>
+        </w:rPr>
+        <w:t>@</w:t>
+      </w:r>
+      <w:proofErr w:type="spellStart"/>
+      <w:r>
+        <w:rPr>
+          <w:rFonts w:ascii="Courier New" w:eastAsia="Times New Roman" w:hAnsi="Courier New" w:cs="Courier New"/>
+          <w:sz w:val="20"/>
+          <w:szCs w:val="20"/>
+          <w:lang w:eastAsia="en-IN"/>
+        </w:rPr>
+        <w:t>ConfigurationProperties</w:t>
+      </w:r>
+      <w:proofErr w:type="spellEnd"/>
     </w:p>
     <w:p>
       <w:pPr>
@@ -1973,6 +2126,7 @@
           <w:szCs w:val="27"/>
           <w:lang w:eastAsia="en-IN"/>
         </w:rPr>
+        <w:lastRenderedPageBreak/>
         <w:t>9. Bean Lifecycle Methods</w:t>
       </w:r>
     </w:p>
@@ -2057,7 +2211,6 @@
           <w:szCs w:val="20"/>
           <w:lang w:eastAsia="en-IN"/>
         </w:rPr>
-        <w:lastRenderedPageBreak/>
         <w:t>InitializingBean</w:t>
       </w:r>
       <w:proofErr w:type="spellEnd"/>
@@ -2537,6 +2690,7 @@
           <w:szCs w:val="24"/>
           <w:lang w:eastAsia="en-IN"/>
         </w:rPr>
+        <w:lastRenderedPageBreak/>
         <w:t xml:space="preserve">Inject Properties </w:t>
       </w:r>
     </w:p>
@@ -2584,7 +2738,6 @@
           <w:szCs w:val="27"/>
           <w:lang w:eastAsia="en-IN"/>
         </w:rPr>
-        <w:lastRenderedPageBreak/>
         <w:t>12. Constructor Injection</w:t>
       </w:r>
     </w:p>
@@ -2867,6 +3020,7 @@
           <w:szCs w:val="24"/>
           <w:lang w:eastAsia="en-IN"/>
         </w:rPr>
+        <w:lastRenderedPageBreak/>
         <w:pict>
           <v:rect id="_x0000_i1038" style="width:0;height:1.5pt" o:hralign="center" o:hrstd="t" o:hr="t" fillcolor="#a0a0a0" stroked="f"/>
         </w:pict>
@@ -2918,7 +3072,6 @@
           <w:szCs w:val="20"/>
           <w:lang w:eastAsia="en-IN"/>
         </w:rPr>
-        <w:lastRenderedPageBreak/>
         <w:t>@Component</w:t>
       </w:r>
       <w:r>
@@ -3290,6 +3443,7 @@
           <w:szCs w:val="24"/>
           <w:lang w:eastAsia="en-IN"/>
         </w:rPr>
+        <w:lastRenderedPageBreak/>
         <w:pict>
           <v:rect id="_x0000_i1041" style="width:0;height:1.5pt" o:hralign="center" o:hrstd="t" o:hr="t" fillcolor="#a0a0a0" stroked="f"/>
         </w:pict>
@@ -3341,7 +3495,6 @@
           <w:szCs w:val="24"/>
           <w:lang w:eastAsia="en-IN"/>
         </w:rPr>
-        <w:lastRenderedPageBreak/>
         <w:t xml:space="preserve">Resource Interface </w:t>
       </w:r>
     </w:p>
@@ -3718,6 +3871,7 @@
           <w:szCs w:val="24"/>
           <w:lang w:eastAsia="en-IN"/>
         </w:rPr>
+        <w:lastRenderedPageBreak/>
         <w:t xml:space="preserve">Advice </w:t>
       </w:r>
     </w:p>
@@ -3821,7 +3975,6 @@
           <w:szCs w:val="24"/>
           <w:lang w:eastAsia="en-IN"/>
         </w:rPr>
-        <w:lastRenderedPageBreak/>
         <w:pict>
           <v:rect id="_x0000_i1044" style="width:0;height:1.5pt" o:hralign="center" o:hrstd="t" o:hr="t" fillcolor="#a0a0a0" stroked="f"/>
         </w:pict>
@@ -4146,6 +4299,7 @@
           <w:szCs w:val="24"/>
           <w:lang w:eastAsia="en-IN"/>
         </w:rPr>
+        <w:lastRenderedPageBreak/>
         <w:t xml:space="preserve">Spring Dependencies </w:t>
       </w:r>
     </w:p>
@@ -4217,7 +4371,6 @@
           <w:szCs w:val="24"/>
           <w:lang w:eastAsia="en-IN"/>
         </w:rPr>
-        <w:lastRenderedPageBreak/>
         <w:t xml:space="preserve">Controller </w:t>
       </w:r>
     </w:p>
@@ -4766,6 +4919,7 @@
           <w:szCs w:val="24"/>
           <w:lang w:eastAsia="en-IN"/>
         </w:rPr>
+        <w:lastRenderedPageBreak/>
         <w:t xml:space="preserve">Circular Dependency </w:t>
       </w:r>
     </w:p>
@@ -8793,6 +8947,29 @@
     <w:name w:val="Normal"/>
     <w:qFormat/>
   </w:style>
+  <w:style w:type="paragraph" w:styleId="Heading1">
+    <w:name w:val="heading 1"/>
+    <w:basedOn w:val="Normal"/>
+    <w:next w:val="Normal"/>
+    <w:link w:val="Heading1Char"/>
+    <w:uiPriority w:val="9"/>
+    <w:qFormat/>
+    <w:rsid w:val="009B6B54"/>
+    <w:pPr>
+      <w:keepNext/>
+      <w:keepLines/>
+      <w:spacing w:before="480" w:after="0"/>
+      <w:outlineLvl w:val="0"/>
+    </w:pPr>
+    <w:rPr>
+      <w:rFonts w:asciiTheme="majorHAnsi" w:eastAsiaTheme="majorEastAsia" w:hAnsiTheme="majorHAnsi" w:cstheme="majorBidi"/>
+      <w:b/>
+      <w:bCs/>
+      <w:color w:val="365F91" w:themeColor="accent1" w:themeShade="BF"/>
+      <w:sz w:val="28"/>
+      <w:szCs w:val="28"/>
+    </w:rPr>
+  </w:style>
   <w:style w:type="paragraph" w:styleId="Heading2">
     <w:name w:val="heading 2"/>
     <w:basedOn w:val="Normal"/>
@@ -8901,6 +9078,21 @@
       <w:rFonts w:ascii="Courier New" w:eastAsia="Times New Roman" w:hAnsi="Courier New" w:cs="Courier New"/>
       <w:sz w:val="20"/>
       <w:szCs w:val="20"/>
+    </w:rPr>
+  </w:style>
+  <w:style w:type="character" w:customStyle="1" w:styleId="Heading1Char">
+    <w:name w:val="Heading 1 Char"/>
+    <w:basedOn w:val="DefaultParagraphFont"/>
+    <w:link w:val="Heading1"/>
+    <w:uiPriority w:val="9"/>
+    <w:rsid w:val="009B6B54"/>
+    <w:rPr>
+      <w:rFonts w:asciiTheme="majorHAnsi" w:eastAsiaTheme="majorEastAsia" w:hAnsiTheme="majorHAnsi" w:cstheme="majorBidi"/>
+      <w:b/>
+      <w:bCs/>
+      <w:color w:val="365F91" w:themeColor="accent1" w:themeShade="BF"/>
+      <w:sz w:val="28"/>
+      <w:szCs w:val="28"/>
     </w:rPr>
   </w:style>
 </w:styles>
@@ -9066,6 +9258,29 @@
     <w:name w:val="Normal"/>
     <w:qFormat/>
   </w:style>
+  <w:style w:type="paragraph" w:styleId="Heading1">
+    <w:name w:val="heading 1"/>
+    <w:basedOn w:val="Normal"/>
+    <w:next w:val="Normal"/>
+    <w:link w:val="Heading1Char"/>
+    <w:uiPriority w:val="9"/>
+    <w:qFormat/>
+    <w:rsid w:val="009B6B54"/>
+    <w:pPr>
+      <w:keepNext/>
+      <w:keepLines/>
+      <w:spacing w:before="480" w:after="0"/>
+      <w:outlineLvl w:val="0"/>
+    </w:pPr>
+    <w:rPr>
+      <w:rFonts w:asciiTheme="majorHAnsi" w:eastAsiaTheme="majorEastAsia" w:hAnsiTheme="majorHAnsi" w:cstheme="majorBidi"/>
+      <w:b/>
+      <w:bCs/>
+      <w:color w:val="365F91" w:themeColor="accent1" w:themeShade="BF"/>
+      <w:sz w:val="28"/>
+      <w:szCs w:val="28"/>
+    </w:rPr>
+  </w:style>
   <w:style w:type="paragraph" w:styleId="Heading2">
     <w:name w:val="heading 2"/>
     <w:basedOn w:val="Normal"/>
@@ -9174,6 +9389,21 @@
       <w:rFonts w:ascii="Courier New" w:eastAsia="Times New Roman" w:hAnsi="Courier New" w:cs="Courier New"/>
       <w:sz w:val="20"/>
       <w:szCs w:val="20"/>
+    </w:rPr>
+  </w:style>
+  <w:style w:type="character" w:customStyle="1" w:styleId="Heading1Char">
+    <w:name w:val="Heading 1 Char"/>
+    <w:basedOn w:val="DefaultParagraphFont"/>
+    <w:link w:val="Heading1"/>
+    <w:uiPriority w:val="9"/>
+    <w:rsid w:val="009B6B54"/>
+    <w:rPr>
+      <w:rFonts w:asciiTheme="majorHAnsi" w:eastAsiaTheme="majorEastAsia" w:hAnsiTheme="majorHAnsi" w:cstheme="majorBidi"/>
+      <w:b/>
+      <w:bCs/>
+      <w:color w:val="365F91" w:themeColor="accent1" w:themeShade="BF"/>
+      <w:sz w:val="28"/>
+      <w:szCs w:val="28"/>
     </w:rPr>
   </w:style>
 </w:styles>

</xml_diff>